<commit_message>
The contents page listed itself
toc() added its own "Contents" title with add_heading(level=1), and the TOC field
directly below it collects Heading 1. So every contents page opened with an entry
for itself, pointing at its own page -- visible in the rendered PDF as
"Contents .... 1" as the first line under the word Contents.

The title is now a styled paragraph that matches a level-1 heading rather than
being one. It reads identically and the field cannot see it.

Found by reading the rendered PDF rather than the .docx. The XML looked correct:
a heading, then a field. What the field DOES with the heading above it only shows
once Word computes it, which is the same reason the TOC is a field in the first
place.

KUT document gate: OK, 100 assertions.

Co-Authored-By: Claude Opus 5 <noreply@anthropic.com>
</commit_message>
<xml_diff>
--- a/KUT_DOCS_WORKING/issued/KUT_BIM_Execution_Plan.docx
+++ b/KUT_DOCS_WORKING/issued/KUT_BIM_Execution_Plan.docx
@@ -290,12 +290,17 @@
     </w:p>
     <w:p>
       <w:pPr>
-        <w:pStyle w:val="Heading1"/>
         <w:pBdr>
           <w:bottom w:val="single" w:sz="8" w:space="4" w:color="1F3654"/>
         </w:pBdr>
       </w:pPr>
       <w:r>
+        <w:rPr>
+          <w:rFonts w:ascii="Calibri" w:hAnsi="Calibri"/>
+          <w:b/>
+          <w:color w:val="1F3654"/>
+          <w:sz w:val="32"/>
+        </w:rPr>
         <w:t>Contents</w:t>
       </w:r>
     </w:p>

</xml_diff>

<commit_message>
The contents page listed itself (#922)
toc() added its own "Contents" title with add_heading(level=1), and the TOC field
directly below it collects Heading 1. So every contents page opened with an entry
for itself, pointing at its own page -- visible in the rendered PDF as
"Contents .... 1" as the first line under the word Contents.

The title is now a styled paragraph that matches a level-1 heading rather than
being one. It reads identically and the field cannot see it.

Found by reading the rendered PDF rather than the .docx. The XML looked correct:
a heading, then a field. What the field DOES with the heading above it only shows
once Word computes it, which is the same reason the TOC is a field in the first
place.

KUT document gate: OK, 100 assertions.

Co-authored-by: Claude Opus 5 <noreply@anthropic.com>
</commit_message>
<xml_diff>
--- a/KUT_DOCS_WORKING/issued/KUT_BIM_Execution_Plan.docx
+++ b/KUT_DOCS_WORKING/issued/KUT_BIM_Execution_Plan.docx
@@ -290,12 +290,17 @@
     </w:p>
     <w:p>
       <w:pPr>
-        <w:pStyle w:val="Heading1"/>
         <w:pBdr>
           <w:bottom w:val="single" w:sz="8" w:space="4" w:color="1F3654"/>
         </w:pBdr>
       </w:pPr>
       <w:r>
+        <w:rPr>
+          <w:rFonts w:ascii="Calibri" w:hAnsi="Calibri"/>
+          <w:b/>
+          <w:color w:val="1F3654"/>
+          <w:sz w:val="32"/>
+        </w:rPr>
         <w:t>Contents</w:t>
       </w:r>
     </w:p>

</xml_diff>